<commit_message>
Updated the args for the analyze_transit script.
</commit_message>
<xml_diff>
--- a/User manual for the planetary transit experiment.docx
+++ b/User manual for the planetary transit experiment.docx
@@ -1,6 +1,6 @@
 
 <file path=word/document.xml><?xml version="1.0" encoding="utf-8"?>
-<w:document xmlns:wpc="http://schemas.microsoft.com/office/word/2010/wordprocessingCanvas" xmlns:cx="http://schemas.microsoft.com/office/drawing/2014/chartex" xmlns:cx1="http://schemas.microsoft.com/office/drawing/2015/9/8/chartex" xmlns:mc="http://schemas.openxmlformats.org/markup-compatibility/2006" xmlns:o="urn:schemas-microsoft-com:office:office" xmlns:r="http://schemas.openxmlformats.org/officeDocument/2006/relationships" xmlns:m="http://schemas.openxmlformats.org/officeDocument/2006/math" xmlns:v="urn:schemas-microsoft-com:vml" xmlns:wp14="http://schemas.microsoft.com/office/word/2010/wordprocessingDrawing" xmlns:wp="http://schemas.openxmlformats.org/drawingml/2006/wordprocessingDrawing" xmlns:w10="urn:schemas-microsoft-com:office:word" xmlns:w="http://schemas.openxmlformats.org/wordprocessingml/2006/main" xmlns:w14="http://schemas.microsoft.com/office/word/2010/wordml" xmlns:w15="http://schemas.microsoft.com/office/word/2012/wordml" xmlns:w16se="http://schemas.microsoft.com/office/word/2015/wordml/symex" xmlns:wpg="http://schemas.microsoft.com/office/word/2010/wordprocessingGroup" xmlns:wpi="http://schemas.microsoft.com/office/word/2010/wordprocessingInk" xmlns:wne="http://schemas.microsoft.com/office/word/2006/wordml" xmlns:wps="http://schemas.microsoft.com/office/word/2010/wordprocessingShape" mc:Ignorable="w14 w15 w16se wp14">
+<w:document xmlns:wpc="http://schemas.microsoft.com/office/word/2010/wordprocessingCanvas" xmlns:cx="http://schemas.microsoft.com/office/drawing/2014/chartex" xmlns:cx1="http://schemas.microsoft.com/office/drawing/2015/9/8/chartex" xmlns:cx2="http://schemas.microsoft.com/office/drawing/2015/10/21/chartex" xmlns:cx3="http://schemas.microsoft.com/office/drawing/2016/5/9/chartex" xmlns:cx4="http://schemas.microsoft.com/office/drawing/2016/5/10/chartex" xmlns:cx5="http://schemas.microsoft.com/office/drawing/2016/5/11/chartex" xmlns:cx6="http://schemas.microsoft.com/office/drawing/2016/5/12/chartex" xmlns:cx7="http://schemas.microsoft.com/office/drawing/2016/5/13/chartex" xmlns:cx8="http://schemas.microsoft.com/office/drawing/2016/5/14/chartex" xmlns:mc="http://schemas.openxmlformats.org/markup-compatibility/2006" xmlns:aink="http://schemas.microsoft.com/office/drawing/2016/ink" xmlns:am3d="http://schemas.microsoft.com/office/drawing/2017/model3d" xmlns:o="urn:schemas-microsoft-com:office:office" xmlns:r="http://schemas.openxmlformats.org/officeDocument/2006/relationships" xmlns:m="http://schemas.openxmlformats.org/officeDocument/2006/math" xmlns:v="urn:schemas-microsoft-com:vml" xmlns:wp14="http://schemas.microsoft.com/office/word/2010/wordprocessingDrawing" xmlns:wp="http://schemas.openxmlformats.org/drawingml/2006/wordprocessingDrawing" xmlns:w10="urn:schemas-microsoft-com:office:word" xmlns:w="http://schemas.openxmlformats.org/wordprocessingml/2006/main" xmlns:w14="http://schemas.microsoft.com/office/word/2010/wordml" xmlns:w15="http://schemas.microsoft.com/office/word/2012/wordml" xmlns:w16cid="http://schemas.microsoft.com/office/word/2016/wordml/cid" xmlns:w16se="http://schemas.microsoft.com/office/word/2015/wordml/symex" xmlns:wpg="http://schemas.microsoft.com/office/word/2010/wordprocessingGroup" xmlns:wpi="http://schemas.microsoft.com/office/word/2010/wordprocessingInk" xmlns:wne="http://schemas.microsoft.com/office/word/2006/wordml" xmlns:wps="http://schemas.microsoft.com/office/word/2010/wordprocessingShape" mc:Ignorable="w14 w15 w16se w16cid wp14">
   <w:body>
     <w:p>
       <w:pPr>
@@ -124,7 +124,15 @@
     </w:p>
     <w:p>
       <w:r>
-        <w:t xml:space="preserve">The final part is a non-proprietary printing utility so that the PDF files generated for the visitors can be printing on paper. It operation is described in section </w:t>
+        <w:t xml:space="preserve">The final part is a non-proprietary printing utility so that the PDF files generated for the visitors can be printing on paper. </w:t>
+      </w:r>
+      <w:proofErr w:type="gramStart"/>
+      <w:r>
+        <w:t>It</w:t>
+      </w:r>
+      <w:proofErr w:type="gramEnd"/>
+      <w:r>
+        <w:t xml:space="preserve"> operation is described in section </w:t>
       </w:r>
       <w:r>
         <w:fldChar w:fldCharType="begin"/>
@@ -176,16 +184,30 @@
       <w:r>
         <w:t>Access to the computer</w:t>
       </w:r>
+      <w:bookmarkStart w:id="1" w:name="_GoBack"/>
       <w:bookmarkEnd w:id="0"/>
-    </w:p>
-    <w:p>
-      <w:r>
-        <w:t>The computer to operate the experiment is a Dell laptop labeled NB38-TA21. It should already be installed at the stand.</w:t>
-      </w:r>
-    </w:p>
-    <w:p>
-      <w:r>
-        <w:t>The credentials to access the laptop are as follows:</w:t>
+      <w:bookmarkEnd w:id="1"/>
+    </w:p>
+    <w:p>
+      <w:r>
+        <w:t xml:space="preserve">The computer to operate the experiment </w:t>
+      </w:r>
+      <w:r>
+        <w:t xml:space="preserve">should </w:t>
+      </w:r>
+      <w:r>
+        <w:t>be installed at the stand.</w:t>
+      </w:r>
+    </w:p>
+    <w:p>
+      <w:r>
+        <w:t>The credentials to access the</w:t>
+      </w:r>
+      <w:r>
+        <w:t xml:space="preserve"> computer</w:t>
+      </w:r>
+      <w:r>
+        <w:t xml:space="preserve"> are as follows:</w:t>
       </w:r>
     </w:p>
     <w:tbl>
@@ -205,7 +227,7 @@
       </w:tblPr>
       <w:tblGrid>
         <w:gridCol w:w="1195"/>
-        <w:gridCol w:w="1290"/>
+        <w:gridCol w:w="1647"/>
       </w:tblGrid>
       <w:tr>
         <w:trPr>
@@ -228,7 +250,7 @@
           <w:p>
             <w:proofErr w:type="spellStart"/>
             <w:r>
-              <w:t>vicouser</w:t>
+              <w:t>ndw</w:t>
             </w:r>
             <w:proofErr w:type="spellEnd"/>
           </w:p>
@@ -254,7 +276,7 @@
           </w:tcPr>
           <w:p>
             <w:r>
-              <w:t>didpfdvu.97</w:t>
+              <w:t>Mpaempae123!</w:t>
             </w:r>
           </w:p>
         </w:tc>
@@ -262,18 +284,24 @@
     </w:tbl>
     <w:p>
       <w:r>
-        <w:t>Please be aware that the laptop will not be connected to the internet, so any additional files that you might need (e.g. an image of the Sun) will have to be brought on a pen drive.</w:t>
+        <w:t xml:space="preserve">Please be aware that the </w:t>
+      </w:r>
+      <w:r>
+        <w:t xml:space="preserve">computer might </w:t>
+      </w:r>
+      <w:r>
+        <w:t>not be connected to the internet, so any additional files that you might need (e.g. an image of the Sun) will have to be brought on a pen drive.</w:t>
       </w:r>
     </w:p>
     <w:p>
       <w:pPr>
         <w:pStyle w:val="Heading1"/>
       </w:pPr>
-      <w:bookmarkStart w:id="1" w:name="_Ref108089892"/>
+      <w:bookmarkStart w:id="2" w:name="_Ref108089892"/>
       <w:r>
         <w:t>The target</w:t>
       </w:r>
-      <w:bookmarkEnd w:id="1"/>
+      <w:bookmarkEnd w:id="2"/>
     </w:p>
     <w:p>
       <w:r>
@@ -317,31 +345,7 @@
         <w:t>The window that pops us shall be dragged to the second monitor located on the other side of the pendulum to act as a target. Maximize the window by double-clicking on the top menu bar.</w:t>
       </w:r>
       <w:r>
-        <w:t xml:space="preserve"> </w:t>
-      </w:r>
-      <w:r>
-        <w:t xml:space="preserve">The command line window that </w:t>
-      </w:r>
-      <w:r>
-        <w:t xml:space="preserve">also </w:t>
-      </w:r>
-      <w:r>
-        <w:t>pops-up can be min</w:t>
-      </w:r>
-      <w:r>
-        <w:t xml:space="preserve">imized, but it has to stay open because, </w:t>
-      </w:r>
-      <w:r>
-        <w:t>otherwise</w:t>
-      </w:r>
-      <w:r>
-        <w:t>,</w:t>
-      </w:r>
-      <w:r>
-        <w:t xml:space="preserve"> the</w:t>
-      </w:r>
-      <w:r>
-        <w:t xml:space="preserve"> main display </w:t>
+        <w:t xml:space="preserve"> The command line window that also pops-up can be minimized, but it has to stay open because, otherwise, the main display </w:t>
       </w:r>
       <w:r>
         <w:t xml:space="preserve">will </w:t>
@@ -423,35 +427,35 @@
               <w:jc w:val="right"/>
             </w:pPr>
             <w:r>
+              <w:t>Arrow right:</w:t>
+            </w:r>
+          </w:p>
+        </w:tc>
+        <w:tc>
+          <w:tcPr>
+            <w:tcW w:w="0" w:type="auto"/>
+          </w:tcPr>
+          <w:p>
+            <w:r>
+              <w:t>Make star thinner</w:t>
+            </w:r>
+          </w:p>
+        </w:tc>
+      </w:tr>
+      <w:tr>
+        <w:trPr>
+          <w:jc w:val="center"/>
+        </w:trPr>
+        <w:tc>
+          <w:tcPr>
+            <w:tcW w:w="0" w:type="auto"/>
+          </w:tcPr>
+          <w:p>
+            <w:pPr>
+              <w:jc w:val="right"/>
+            </w:pPr>
+            <w:r>
               <w:lastRenderedPageBreak/>
-              <w:t>Arrow right:</w:t>
-            </w:r>
-          </w:p>
-        </w:tc>
-        <w:tc>
-          <w:tcPr>
-            <w:tcW w:w="0" w:type="auto"/>
-          </w:tcPr>
-          <w:p>
-            <w:r>
-              <w:t>Make star thinner</w:t>
-            </w:r>
-          </w:p>
-        </w:tc>
-      </w:tr>
-      <w:tr>
-        <w:trPr>
-          <w:jc w:val="center"/>
-        </w:trPr>
-        <w:tc>
-          <w:tcPr>
-            <w:tcW w:w="0" w:type="auto"/>
-          </w:tcPr>
-          <w:p>
-            <w:pPr>
-              <w:jc w:val="right"/>
-            </w:pPr>
-            <w:r>
               <w:t>Arrow up:</w:t>
             </w:r>
           </w:p>
@@ -990,27 +994,15 @@
       <w:pPr>
         <w:pStyle w:val="Heading1"/>
       </w:pPr>
-      <w:bookmarkStart w:id="2" w:name="_Ref108089934"/>
+      <w:bookmarkStart w:id="3" w:name="_Ref108089934"/>
       <w:r>
         <w:t>The payload</w:t>
       </w:r>
-      <w:bookmarkEnd w:id="2"/>
-    </w:p>
-    <w:p>
-      <w:r>
-        <w:t xml:space="preserve">The </w:t>
-      </w:r>
-      <w:r>
-        <w:t xml:space="preserve">second software </w:t>
-      </w:r>
-      <w:r>
-        <w:t xml:space="preserve">element of the experiment is the simulated </w:t>
-      </w:r>
-      <w:r>
-        <w:t>payload</w:t>
-      </w:r>
-      <w:r>
-        <w:t xml:space="preserve">, </w:t>
+      <w:bookmarkEnd w:id="3"/>
+    </w:p>
+    <w:p>
+      <w:r>
+        <w:t xml:space="preserve">The second software element of the experiment is the simulated payload, </w:t>
       </w:r>
       <w:r>
         <w:t>which uses the webcam to measure to total brightness of the scene, generating the so-called light curves.</w:t>
@@ -1050,16 +1042,7 @@
     </w:p>
     <w:p>
       <w:r>
-        <w:t xml:space="preserve">The window that pops us shall be </w:t>
-      </w:r>
-      <w:r>
-        <w:t>kept on one side of the laptop screen to allow the operator to follow the acquisition of the light curves</w:t>
-      </w:r>
-      <w:r>
-        <w:t xml:space="preserve">. The command line window that also pops-up can be minimized, but it has to stay open because, otherwise, the main </w:t>
-      </w:r>
-      <w:r>
-        <w:t xml:space="preserve">window </w:t>
+        <w:t xml:space="preserve">The window that pops us shall be kept on one side of the laptop screen to allow the operator to follow the acquisition of the light curves. The command line window that also pops-up can be minimized, but it has to stay open because, otherwise, the main window </w:t>
       </w:r>
       <w:r>
         <w:t xml:space="preserve">will close </w:t>
@@ -1161,10 +1144,7 @@
           </w:tcPr>
           <w:p>
             <w:r>
-              <w:t xml:space="preserve">Move ROI to the </w:t>
-            </w:r>
-            <w:r>
-              <w:t>right</w:t>
+              <w:t>Move ROI to the right</w:t>
             </w:r>
           </w:p>
         </w:tc>
@@ -1192,10 +1172,7 @@
           </w:tcPr>
           <w:p>
             <w:r>
-              <w:t xml:space="preserve">Move ROI </w:t>
-            </w:r>
-            <w:r>
-              <w:t>up</w:t>
+              <w:t>Move ROI up</w:t>
             </w:r>
           </w:p>
         </w:tc>
@@ -1223,10 +1200,7 @@
           </w:tcPr>
           <w:p>
             <w:r>
-              <w:t xml:space="preserve">Move ROI </w:t>
-            </w:r>
-            <w:r>
-              <w:t>down</w:t>
+              <w:t>Move ROI down</w:t>
             </w:r>
           </w:p>
         </w:tc>
@@ -1245,91 +1219,211 @@
             </w:pPr>
             <w:proofErr w:type="spellStart"/>
             <w:r>
-              <w:t>Shift+</w:t>
+              <w:t>Shift+Arrow</w:t>
+            </w:r>
+            <w:proofErr w:type="spellEnd"/>
+            <w:r>
+              <w:t xml:space="preserve"> left:</w:t>
+            </w:r>
+          </w:p>
+        </w:tc>
+        <w:tc>
+          <w:tcPr>
+            <w:tcW w:w="0" w:type="auto"/>
+          </w:tcPr>
+          <w:p>
+            <w:r>
+              <w:t>Move ROI fast to the left</w:t>
+            </w:r>
+          </w:p>
+        </w:tc>
+      </w:tr>
+      <w:tr>
+        <w:trPr>
+          <w:jc w:val="center"/>
+        </w:trPr>
+        <w:tc>
+          <w:tcPr>
+            <w:tcW w:w="0" w:type="auto"/>
+          </w:tcPr>
+          <w:p>
+            <w:pPr>
+              <w:jc w:val="right"/>
+            </w:pPr>
+            <w:proofErr w:type="spellStart"/>
+            <w:r>
+              <w:t>Shift+Arrow</w:t>
+            </w:r>
+            <w:proofErr w:type="spellEnd"/>
+            <w:r>
+              <w:t xml:space="preserve"> right:</w:t>
+            </w:r>
+          </w:p>
+        </w:tc>
+        <w:tc>
+          <w:tcPr>
+            <w:tcW w:w="0" w:type="auto"/>
+          </w:tcPr>
+          <w:p>
+            <w:r>
+              <w:t>Move ROI fast to the right</w:t>
+            </w:r>
+          </w:p>
+        </w:tc>
+      </w:tr>
+      <w:tr>
+        <w:trPr>
+          <w:jc w:val="center"/>
+        </w:trPr>
+        <w:tc>
+          <w:tcPr>
+            <w:tcW w:w="0" w:type="auto"/>
+          </w:tcPr>
+          <w:p>
+            <w:pPr>
+              <w:jc w:val="right"/>
+            </w:pPr>
+            <w:proofErr w:type="spellStart"/>
+            <w:r>
+              <w:t>Shift+Arrow</w:t>
+            </w:r>
+            <w:proofErr w:type="spellEnd"/>
+            <w:r>
+              <w:t xml:space="preserve"> up:</w:t>
+            </w:r>
+          </w:p>
+        </w:tc>
+        <w:tc>
+          <w:tcPr>
+            <w:tcW w:w="0" w:type="auto"/>
+          </w:tcPr>
+          <w:p>
+            <w:r>
+              <w:t>Move ROI fast up</w:t>
+            </w:r>
+          </w:p>
+        </w:tc>
+      </w:tr>
+      <w:tr>
+        <w:trPr>
+          <w:jc w:val="center"/>
+        </w:trPr>
+        <w:tc>
+          <w:tcPr>
+            <w:tcW w:w="0" w:type="auto"/>
+          </w:tcPr>
+          <w:p>
+            <w:pPr>
+              <w:jc w:val="right"/>
+            </w:pPr>
+            <w:proofErr w:type="spellStart"/>
+            <w:r>
+              <w:t>Shift+Arrow</w:t>
+            </w:r>
+            <w:proofErr w:type="spellEnd"/>
+            <w:r>
+              <w:t xml:space="preserve"> down:</w:t>
+            </w:r>
+          </w:p>
+        </w:tc>
+        <w:tc>
+          <w:tcPr>
+            <w:tcW w:w="0" w:type="auto"/>
+          </w:tcPr>
+          <w:p>
+            <w:r>
+              <w:t>Move ROI fast down</w:t>
+            </w:r>
+          </w:p>
+        </w:tc>
+      </w:tr>
+      <w:tr>
+        <w:trPr>
+          <w:jc w:val="center"/>
+        </w:trPr>
+        <w:tc>
+          <w:tcPr>
+            <w:tcW w:w="0" w:type="auto"/>
+          </w:tcPr>
+          <w:p>
+            <w:pPr>
+              <w:jc w:val="right"/>
+            </w:pPr>
+            <w:proofErr w:type="spellStart"/>
+            <w:r>
+              <w:t>Ctrl+Arrow</w:t>
+            </w:r>
+            <w:proofErr w:type="spellEnd"/>
+            <w:r>
+              <w:t xml:space="preserve"> left:</w:t>
+            </w:r>
+          </w:p>
+        </w:tc>
+        <w:tc>
+          <w:tcPr>
+            <w:tcW w:w="0" w:type="auto"/>
+          </w:tcPr>
+          <w:p>
+            <w:r>
+              <w:t>Decrease the width of the ROI</w:t>
+            </w:r>
+          </w:p>
+        </w:tc>
+      </w:tr>
+      <w:tr>
+        <w:trPr>
+          <w:jc w:val="center"/>
+        </w:trPr>
+        <w:tc>
+          <w:tcPr>
+            <w:tcW w:w="0" w:type="auto"/>
+          </w:tcPr>
+          <w:p>
+            <w:pPr>
+              <w:jc w:val="right"/>
+            </w:pPr>
+            <w:proofErr w:type="spellStart"/>
+            <w:r>
+              <w:t>Ctrl+Arrow</w:t>
+            </w:r>
+            <w:proofErr w:type="spellEnd"/>
+            <w:r>
+              <w:t xml:space="preserve"> right:</w:t>
+            </w:r>
+          </w:p>
+        </w:tc>
+        <w:tc>
+          <w:tcPr>
+            <w:tcW w:w="0" w:type="auto"/>
+          </w:tcPr>
+          <w:p>
+            <w:r>
+              <w:t>Increase the width of the ROI</w:t>
+            </w:r>
+          </w:p>
+        </w:tc>
+      </w:tr>
+      <w:tr>
+        <w:trPr>
+          <w:jc w:val="center"/>
+        </w:trPr>
+        <w:tc>
+          <w:tcPr>
+            <w:tcW w:w="0" w:type="auto"/>
+          </w:tcPr>
+          <w:p>
+            <w:pPr>
+              <w:jc w:val="right"/>
+            </w:pPr>
+            <w:proofErr w:type="spellStart"/>
+            <w:r>
+              <w:t>Ctrl+</w:t>
             </w:r>
             <w:r>
               <w:t>Arrow</w:t>
             </w:r>
             <w:proofErr w:type="spellEnd"/>
             <w:r>
-              <w:t xml:space="preserve"> left:</w:t>
-            </w:r>
-          </w:p>
-        </w:tc>
-        <w:tc>
-          <w:tcPr>
-            <w:tcW w:w="0" w:type="auto"/>
-          </w:tcPr>
-          <w:p>
-            <w:r>
-              <w:t xml:space="preserve">Move ROI </w:t>
-            </w:r>
-            <w:r>
-              <w:t xml:space="preserve">fast </w:t>
-            </w:r>
-            <w:r>
-              <w:t>to the left</w:t>
-            </w:r>
-          </w:p>
-        </w:tc>
-      </w:tr>
-      <w:tr>
-        <w:trPr>
-          <w:jc w:val="center"/>
-        </w:trPr>
-        <w:tc>
-          <w:tcPr>
-            <w:tcW w:w="0" w:type="auto"/>
-          </w:tcPr>
-          <w:p>
-            <w:pPr>
-              <w:jc w:val="right"/>
-            </w:pPr>
-            <w:proofErr w:type="spellStart"/>
-            <w:r>
-              <w:t>Shift+Arrow</w:t>
-            </w:r>
-            <w:proofErr w:type="spellEnd"/>
-            <w:r>
-              <w:t xml:space="preserve"> right:</w:t>
-            </w:r>
-          </w:p>
-        </w:tc>
-        <w:tc>
-          <w:tcPr>
-            <w:tcW w:w="0" w:type="auto"/>
-          </w:tcPr>
-          <w:p>
-            <w:r>
-              <w:t xml:space="preserve">Move ROI </w:t>
-            </w:r>
-            <w:r>
-              <w:t xml:space="preserve">fast </w:t>
-            </w:r>
-            <w:r>
-              <w:t>to the right</w:t>
-            </w:r>
-          </w:p>
-        </w:tc>
-      </w:tr>
-      <w:tr>
-        <w:trPr>
-          <w:jc w:val="center"/>
-        </w:trPr>
-        <w:tc>
-          <w:tcPr>
-            <w:tcW w:w="0" w:type="auto"/>
-          </w:tcPr>
-          <w:p>
-            <w:pPr>
-              <w:jc w:val="right"/>
-            </w:pPr>
-            <w:proofErr w:type="spellStart"/>
-            <w:r>
-              <w:t>Shift+Arrow</w:t>
-            </w:r>
-            <w:proofErr w:type="spellEnd"/>
-            <w:r>
               <w:t xml:space="preserve"> up:</w:t>
             </w:r>
           </w:p>
@@ -1340,127 +1434,7 @@
           </w:tcPr>
           <w:p>
             <w:r>
-              <w:t xml:space="preserve">Move ROI </w:t>
-            </w:r>
-            <w:r>
-              <w:t xml:space="preserve">fast </w:t>
-            </w:r>
-            <w:r>
-              <w:t>up</w:t>
-            </w:r>
-          </w:p>
-        </w:tc>
-      </w:tr>
-      <w:tr>
-        <w:trPr>
-          <w:jc w:val="center"/>
-        </w:trPr>
-        <w:tc>
-          <w:tcPr>
-            <w:tcW w:w="0" w:type="auto"/>
-          </w:tcPr>
-          <w:p>
-            <w:pPr>
-              <w:jc w:val="right"/>
-            </w:pPr>
-            <w:proofErr w:type="spellStart"/>
-            <w:r>
-              <w:t>Shift+Arrow</w:t>
-            </w:r>
-            <w:proofErr w:type="spellEnd"/>
-            <w:r>
-              <w:t xml:space="preserve"> down:</w:t>
-            </w:r>
-          </w:p>
-        </w:tc>
-        <w:tc>
-          <w:tcPr>
-            <w:tcW w:w="0" w:type="auto"/>
-          </w:tcPr>
-          <w:p>
-            <w:r>
-              <w:t xml:space="preserve">Move ROI </w:t>
-            </w:r>
-            <w:r>
-              <w:t xml:space="preserve">fast </w:t>
-            </w:r>
-            <w:r>
-              <w:t>down</w:t>
-            </w:r>
-          </w:p>
-        </w:tc>
-      </w:tr>
-      <w:tr>
-        <w:trPr>
-          <w:jc w:val="center"/>
-        </w:trPr>
-        <w:tc>
-          <w:tcPr>
-            <w:tcW w:w="0" w:type="auto"/>
-          </w:tcPr>
-          <w:p>
-            <w:pPr>
-              <w:jc w:val="right"/>
-            </w:pPr>
-            <w:proofErr w:type="spellStart"/>
-            <w:r>
-              <w:t>Ctrl+</w:t>
-            </w:r>
-            <w:r>
-              <w:t>Arrow</w:t>
-            </w:r>
-            <w:proofErr w:type="spellEnd"/>
-            <w:r>
-              <w:t xml:space="preserve"> left:</w:t>
-            </w:r>
-          </w:p>
-        </w:tc>
-        <w:tc>
-          <w:tcPr>
-            <w:tcW w:w="0" w:type="auto"/>
-          </w:tcPr>
-          <w:p>
-            <w:r>
-              <w:t>Decrease the width of the ROI</w:t>
-            </w:r>
-          </w:p>
-        </w:tc>
-      </w:tr>
-      <w:tr>
-        <w:trPr>
-          <w:jc w:val="center"/>
-        </w:trPr>
-        <w:tc>
-          <w:tcPr>
-            <w:tcW w:w="0" w:type="auto"/>
-          </w:tcPr>
-          <w:p>
-            <w:pPr>
-              <w:jc w:val="right"/>
-            </w:pPr>
-            <w:proofErr w:type="spellStart"/>
-            <w:r>
-              <w:t>Ctrl+</w:t>
-            </w:r>
-            <w:r>
-              <w:t>Arrow</w:t>
-            </w:r>
-            <w:proofErr w:type="spellEnd"/>
-            <w:r>
-              <w:t xml:space="preserve"> right:</w:t>
-            </w:r>
-          </w:p>
-        </w:tc>
-        <w:tc>
-          <w:tcPr>
-            <w:tcW w:w="0" w:type="auto"/>
-          </w:tcPr>
-          <w:p>
-            <w:r>
-              <w:t xml:space="preserve">Increase </w:t>
-            </w:r>
-            <w:r>
-              <w:t>the width of the ROI</w:t>
+              <w:t>Decrease the height of the ROI</w:t>
             </w:r>
           </w:p>
         </w:tc>
@@ -1487,48 +1461,6 @@
             </w:r>
             <w:proofErr w:type="spellEnd"/>
             <w:r>
-              <w:t xml:space="preserve"> up:</w:t>
-            </w:r>
-          </w:p>
-        </w:tc>
-        <w:tc>
-          <w:tcPr>
-            <w:tcW w:w="0" w:type="auto"/>
-          </w:tcPr>
-          <w:p>
-            <w:r>
-              <w:t xml:space="preserve">Decrease the </w:t>
-            </w:r>
-            <w:r>
-              <w:t>height</w:t>
-            </w:r>
-            <w:r>
-              <w:t xml:space="preserve"> of the ROI</w:t>
-            </w:r>
-          </w:p>
-        </w:tc>
-      </w:tr>
-      <w:tr>
-        <w:trPr>
-          <w:jc w:val="center"/>
-        </w:trPr>
-        <w:tc>
-          <w:tcPr>
-            <w:tcW w:w="0" w:type="auto"/>
-          </w:tcPr>
-          <w:p>
-            <w:pPr>
-              <w:jc w:val="right"/>
-            </w:pPr>
-            <w:proofErr w:type="spellStart"/>
-            <w:r>
-              <w:t>Ctrl+</w:t>
-            </w:r>
-            <w:r>
-              <w:t>Arrow</w:t>
-            </w:r>
-            <w:proofErr w:type="spellEnd"/>
-            <w:r>
               <w:t xml:space="preserve"> down:</w:t>
             </w:r>
           </w:p>
@@ -1539,16 +1471,7 @@
           </w:tcPr>
           <w:p>
             <w:r>
-              <w:t>In</w:t>
-            </w:r>
-            <w:r>
-              <w:t xml:space="preserve">crease the </w:t>
-            </w:r>
-            <w:r>
-              <w:t>height</w:t>
-            </w:r>
-            <w:r>
-              <w:t xml:space="preserve"> of the ROI</w:t>
+              <w:t>Increase the height of the ROI</w:t>
             </w:r>
           </w:p>
         </w:tc>
@@ -1594,7 +1517,35 @@
               <w:jc w:val="right"/>
             </w:pPr>
             <w:r>
-              <w:t>m</w:t>
+              <w:t>m:</w:t>
+            </w:r>
+          </w:p>
+        </w:tc>
+        <w:tc>
+          <w:tcPr>
+            <w:tcW w:w="0" w:type="auto"/>
+          </w:tcPr>
+          <w:p>
+            <w:r>
+              <w:t>Toggle monochrome mode</w:t>
+            </w:r>
+          </w:p>
+        </w:tc>
+      </w:tr>
+      <w:tr>
+        <w:trPr>
+          <w:jc w:val="center"/>
+        </w:trPr>
+        <w:tc>
+          <w:tcPr>
+            <w:tcW w:w="0" w:type="auto"/>
+          </w:tcPr>
+          <w:p>
+            <w:pPr>
+              <w:jc w:val="right"/>
+            </w:pPr>
+            <w:r>
+              <w:t>Space Bar</w:t>
             </w:r>
             <w:r>
               <w:t>:</w:t>
@@ -1607,39 +1558,6 @@
           </w:tcPr>
           <w:p>
             <w:r>
-              <w:t>Toggle monochrome mode</w:t>
-            </w:r>
-            <w:bookmarkStart w:id="3" w:name="_GoBack"/>
-            <w:bookmarkEnd w:id="3"/>
-          </w:p>
-        </w:tc>
-      </w:tr>
-      <w:tr>
-        <w:trPr>
-          <w:jc w:val="center"/>
-        </w:trPr>
-        <w:tc>
-          <w:tcPr>
-            <w:tcW w:w="0" w:type="auto"/>
-          </w:tcPr>
-          <w:p>
-            <w:pPr>
-              <w:jc w:val="right"/>
-            </w:pPr>
-            <w:r>
-              <w:t>Space Bar</w:t>
-            </w:r>
-            <w:r>
-              <w:t>:</w:t>
-            </w:r>
-          </w:p>
-        </w:tc>
-        <w:tc>
-          <w:tcPr>
-            <w:tcW w:w="0" w:type="auto"/>
-          </w:tcPr>
-          <w:p>
-            <w:r>
               <w:t>Clear the bottom part of the screen</w:t>
             </w:r>
           </w:p>
@@ -1699,13 +1617,7 @@
     </w:p>
     <w:p>
       <w:r>
-        <w:t xml:space="preserve">The </w:t>
-      </w:r>
-      <w:r>
-        <w:t>payload simulator</w:t>
-      </w:r>
-      <w:r>
-        <w:t xml:space="preserve"> can run continuously, so there is no need to start it and stop it repeatedly.</w:t>
+        <w:t>The payload simulator can run continuously, so there is no need to start it and stop it repeatedly.</w:t>
       </w:r>
     </w:p>
     <w:p>
@@ -1797,78 +1709,51 @@
     </w:p>
     <w:p>
       <w:r>
-        <w:t xml:space="preserve">The plots also show the transit period (T) in seconds, the depth of the transits </w:t>
-      </w:r>
-      <w:r>
-        <w:t xml:space="preserve">(d) </w:t>
-      </w:r>
-      <w:r>
-        <w:t>as percentage of relative obscuration and an estimate of the relative radii (r/R) of the transiting planet and the simulated Sun.</w:t>
+        <w:t>The plots also show the transit period (T) in seconds, the depth of the transits (d) as percentage of relative obscuration and an estimate of the relative radii (r/R) of the transiting planet and the simulated Sun.</w:t>
       </w:r>
       <w:r>
         <w:t xml:space="preserve"> These two plots are automatically saved into a timestamped PDF file (e.g. “</w:t>
       </w:r>
+      <w:r>
+        <w:t xml:space="preserve">Nacht des </w:t>
+      </w:r>
       <w:proofErr w:type="spellStart"/>
       <w:r>
-        <w:t>Nacht</w:t>
+        <w:t>Wissens</w:t>
       </w:r>
       <w:proofErr w:type="spellEnd"/>
       <w:r>
-        <w:t xml:space="preserve"> des </w:t>
+        <w:t xml:space="preserve"> 2022 - 2022_07_07_18_54_08.pdf</w:t>
+      </w:r>
+      <w:r>
+        <w:t>”) that can be printed for the visitors to take home.</w:t>
+      </w:r>
+    </w:p>
+    <w:p>
+      <w:r>
+        <w:t>As explained above, the light curve analysis tool has to be launched manually after each acquisition, but the command-line window can stay open as long as needed.</w:t>
+      </w:r>
+    </w:p>
+    <w:p>
+      <w:pPr>
+        <w:pStyle w:val="Heading1"/>
+      </w:pPr>
+      <w:bookmarkStart w:id="5" w:name="_Ref108090030"/>
+      <w:r>
+        <w:t>The printing utilities</w:t>
+      </w:r>
+      <w:bookmarkEnd w:id="5"/>
+    </w:p>
+    <w:p>
+      <w:r>
+        <w:t xml:space="preserve">The final element of experiment is simply a standard PDF viewer that will allow us to print the result of the analysis for the visitors to take home. This tool should open automatically by double-clicking on the PDF file to be viewed. Once the plot is displayed, you can print it by pressing </w:t>
       </w:r>
       <w:proofErr w:type="spellStart"/>
       <w:r>
-        <w:t>Wissens</w:t>
+        <w:t>Ctrl+P</w:t>
       </w:r>
       <w:proofErr w:type="spellEnd"/>
       <w:r>
-        <w:t xml:space="preserve"> 2022 - 2022_07_07_18_54_08.pdf</w:t>
-      </w:r>
-      <w:r>
-        <w:t>”) that can be printed for the visitors to take home.</w:t>
-      </w:r>
-    </w:p>
-    <w:p>
-      <w:r>
-        <w:t xml:space="preserve">As explained above, the light curve analysis tool has to </w:t>
-      </w:r>
-      <w:proofErr w:type="gramStart"/>
-      <w:r>
-        <w:t>be launched</w:t>
-      </w:r>
-      <w:proofErr w:type="gramEnd"/>
-      <w:r>
-        <w:t xml:space="preserve"> manually after each acquisition, but the command-line window can stay open as long as needed.</w:t>
-      </w:r>
-    </w:p>
-    <w:p>
-      <w:pPr>
-        <w:pStyle w:val="Heading1"/>
-      </w:pPr>
-      <w:bookmarkStart w:id="5" w:name="_Ref108090030"/>
-      <w:r>
-        <w:t>The printing utilities</w:t>
-      </w:r>
-      <w:bookmarkEnd w:id="5"/>
-    </w:p>
-    <w:p>
-      <w:r>
-        <w:t xml:space="preserve">The final element of experiment is simply a standard PDF viewer that will allow us to print the result of the analysis for the visitors to take home. This tool should open automatically by double-clicking on the PDF file to </w:t>
-      </w:r>
-      <w:proofErr w:type="gramStart"/>
-      <w:r>
-        <w:t>be viewed</w:t>
-      </w:r>
-      <w:proofErr w:type="gramEnd"/>
-      <w:r>
-        <w:t xml:space="preserve">. Once the plot is displayed, you can print it by pressing </w:t>
-      </w:r>
-      <w:proofErr w:type="spellStart"/>
-      <w:r>
-        <w:t>Ctrl+P</w:t>
-      </w:r>
-      <w:proofErr w:type="spellEnd"/>
-      <w:r>
         <w:t xml:space="preserve"> and then Enter</w:t>
       </w:r>
       <w:r>
@@ -1877,15 +1762,7 @@
     </w:p>
     <w:p>
       <w:r>
-        <w:t xml:space="preserve">The viewer </w:t>
-      </w:r>
-      <w:proofErr w:type="gramStart"/>
-      <w:r>
-        <w:t>can be kept</w:t>
-      </w:r>
-      <w:proofErr w:type="gramEnd"/>
-      <w:r>
-        <w:t xml:space="preserve"> open as long as necessary and the new files will automatically be shown as they are opened.</w:t>
+        <w:t>The viewer can be kept open as long as necessary and the new files will automatically be shown as they are opened.</w:t>
       </w:r>
     </w:p>
     <w:p>
@@ -1901,15 +1778,7 @@
     </w:p>
     <w:p>
       <w:r>
-        <w:t xml:space="preserve">The </w:t>
-      </w:r>
-      <w:proofErr w:type="gramStart"/>
-      <w:r>
-        <w:t>step-by-step</w:t>
-      </w:r>
-      <w:proofErr w:type="gramEnd"/>
-      <w:r>
-        <w:t xml:space="preserve"> execution of the experiment goes as follows:</w:t>
+        <w:t>The step-by-step execution of the experiment goes as follows:</w:t>
       </w:r>
     </w:p>
     <w:p>
@@ -1981,15 +1850,7 @@
         </w:numPr>
       </w:pPr>
       <w:r>
-        <w:t xml:space="preserve">Adjust the ROI in the payload simulator to include the </w:t>
-      </w:r>
-      <w:proofErr w:type="gramStart"/>
-      <w:r>
-        <w:t>whole</w:t>
-      </w:r>
-      <w:proofErr w:type="gramEnd"/>
-      <w:r>
-        <w:t xml:space="preserve"> simulated Sun but nothing outside the screen (in particular, not the white wall behind the monitor).</w:t>
+        <w:t>Adjust the ROI in the payload simulator to include the whole simulated Sun but nothing outside the screen (in particular, not the white wall behind the monitor).</w:t>
       </w:r>
     </w:p>
     <w:p>
@@ -2067,15 +1928,7 @@
         </w:numPr>
       </w:pPr>
       <w:r>
-        <w:t xml:space="preserve">Invoke the analysis tool by typing “python analyze_transit.py” in a suitable command-line window. You can then explain the plots to the visitor. The title of the plot </w:t>
-      </w:r>
-      <w:proofErr w:type="gramStart"/>
-      <w:r>
-        <w:t>can be personalized</w:t>
-      </w:r>
-      <w:proofErr w:type="gramEnd"/>
-      <w:r>
-        <w:t xml:space="preserve"> by typing instead “python analyze_transit.py –n ‘my name’” (use quotes around the name if you use more than one word).</w:t>
+        <w:t>Invoke the analysis tool by typing “python analyze_transit.py” in a suitable command-line window. You can then explain the plots to the visitor. The title of the plot can be personalized by typing instead “python analyze_transit.py –n ‘my name’” (use quotes around the name if you use more than one word).</w:t>
       </w:r>
     </w:p>
     <w:p>
@@ -2104,7 +1957,7 @@
 </file>
 
 <file path=word/numbering.xml><?xml version="1.0" encoding="utf-8"?>
-<w:numbering xmlns:wpc="http://schemas.microsoft.com/office/word/2010/wordprocessingCanvas" xmlns:cx="http://schemas.microsoft.com/office/drawing/2014/chartex" xmlns:cx1="http://schemas.microsoft.com/office/drawing/2015/9/8/chartex" xmlns:mc="http://schemas.openxmlformats.org/markup-compatibility/2006" xmlns:o="urn:schemas-microsoft-com:office:office" xmlns:r="http://schemas.openxmlformats.org/officeDocument/2006/relationships" xmlns:m="http://schemas.openxmlformats.org/officeDocument/2006/math" xmlns:v="urn:schemas-microsoft-com:vml" xmlns:wp14="http://schemas.microsoft.com/office/word/2010/wordprocessingDrawing" xmlns:wp="http://schemas.openxmlformats.org/drawingml/2006/wordprocessingDrawing" xmlns:w10="urn:schemas-microsoft-com:office:word" xmlns:w="http://schemas.openxmlformats.org/wordprocessingml/2006/main" xmlns:w14="http://schemas.microsoft.com/office/word/2010/wordml" xmlns:w15="http://schemas.microsoft.com/office/word/2012/wordml" xmlns:w16se="http://schemas.microsoft.com/office/word/2015/wordml/symex" xmlns:wpg="http://schemas.microsoft.com/office/word/2010/wordprocessingGroup" xmlns:wpi="http://schemas.microsoft.com/office/word/2010/wordprocessingInk" xmlns:wne="http://schemas.microsoft.com/office/word/2006/wordml" xmlns:wps="http://schemas.microsoft.com/office/word/2010/wordprocessingShape" mc:Ignorable="w14 w15 w16se wp14">
+<w:numbering xmlns:wpc="http://schemas.microsoft.com/office/word/2010/wordprocessingCanvas" xmlns:cx="http://schemas.microsoft.com/office/drawing/2014/chartex" xmlns:cx1="http://schemas.microsoft.com/office/drawing/2015/9/8/chartex" xmlns:cx2="http://schemas.microsoft.com/office/drawing/2015/10/21/chartex" xmlns:cx3="http://schemas.microsoft.com/office/drawing/2016/5/9/chartex" xmlns:cx4="http://schemas.microsoft.com/office/drawing/2016/5/10/chartex" xmlns:cx5="http://schemas.microsoft.com/office/drawing/2016/5/11/chartex" xmlns:cx6="http://schemas.microsoft.com/office/drawing/2016/5/12/chartex" xmlns:cx7="http://schemas.microsoft.com/office/drawing/2016/5/13/chartex" xmlns:cx8="http://schemas.microsoft.com/office/drawing/2016/5/14/chartex" xmlns:mc="http://schemas.openxmlformats.org/markup-compatibility/2006" xmlns:aink="http://schemas.microsoft.com/office/drawing/2016/ink" xmlns:am3d="http://schemas.microsoft.com/office/drawing/2017/model3d" xmlns:o="urn:schemas-microsoft-com:office:office" xmlns:r="http://schemas.openxmlformats.org/officeDocument/2006/relationships" xmlns:m="http://schemas.openxmlformats.org/officeDocument/2006/math" xmlns:v="urn:schemas-microsoft-com:vml" xmlns:wp14="http://schemas.microsoft.com/office/word/2010/wordprocessingDrawing" xmlns:wp="http://schemas.openxmlformats.org/drawingml/2006/wordprocessingDrawing" xmlns:w10="urn:schemas-microsoft-com:office:word" xmlns:w="http://schemas.openxmlformats.org/wordprocessingml/2006/main" xmlns:w14="http://schemas.microsoft.com/office/word/2010/wordml" xmlns:w15="http://schemas.microsoft.com/office/word/2012/wordml" xmlns:w16cid="http://schemas.microsoft.com/office/word/2016/wordml/cid" xmlns:w16se="http://schemas.microsoft.com/office/word/2015/wordml/symex" xmlns:wpg="http://schemas.microsoft.com/office/word/2010/wordprocessingGroup" xmlns:wpi="http://schemas.microsoft.com/office/word/2010/wordprocessingInk" xmlns:wne="http://schemas.microsoft.com/office/word/2006/wordml" xmlns:wps="http://schemas.microsoft.com/office/word/2010/wordprocessingShape" mc:Ignorable="w14 w15 w16se w16cid wp14">
   <w:abstractNum w:abstractNumId="0" w15:restartNumberingAfterBreak="0">
     <w:nsid w:val="3D133171"/>
     <w:multiLevelType w:val="hybridMultilevel"/>
@@ -2404,7 +2257,7 @@
 </file>
 
 <file path=word/styles.xml><?xml version="1.0" encoding="utf-8"?>
-<w:styles xmlns:mc="http://schemas.openxmlformats.org/markup-compatibility/2006" xmlns:r="http://schemas.openxmlformats.org/officeDocument/2006/relationships" xmlns:w="http://schemas.openxmlformats.org/wordprocessingml/2006/main" xmlns:w14="http://schemas.microsoft.com/office/word/2010/wordml" xmlns:w15="http://schemas.microsoft.com/office/word/2012/wordml" xmlns:w16se="http://schemas.microsoft.com/office/word/2015/wordml/symex" mc:Ignorable="w14 w15 w16se">
+<w:styles xmlns:mc="http://schemas.openxmlformats.org/markup-compatibility/2006" xmlns:r="http://schemas.openxmlformats.org/officeDocument/2006/relationships" xmlns:w="http://schemas.openxmlformats.org/wordprocessingml/2006/main" xmlns:w14="http://schemas.microsoft.com/office/word/2010/wordml" xmlns:w15="http://schemas.microsoft.com/office/word/2012/wordml" xmlns:w16cid="http://schemas.microsoft.com/office/word/2016/wordml/cid" xmlns:w16se="http://schemas.microsoft.com/office/word/2015/wordml/symex" mc:Ignorable="w14 w15 w16se w16cid">
   <w:docDefaults>
     <w:rPrDefault>
       <w:rPr>
@@ -2420,7 +2273,7 @@
       </w:pPr>
     </w:pPrDefault>
   </w:docDefaults>
-  <w:latentStyles w:defLockedState="0" w:defUIPriority="99" w:defSemiHidden="0" w:defUnhideWhenUsed="0" w:defQFormat="0" w:count="371">
+  <w:latentStyles w:defLockedState="0" w:defUIPriority="99" w:defSemiHidden="0" w:defUnhideWhenUsed="0" w:defQFormat="0" w:count="375">
     <w:lsdException w:name="Normal" w:uiPriority="0" w:qFormat="1"/>
     <w:lsdException w:name="heading 1" w:uiPriority="9" w:qFormat="1"/>
     <w:lsdException w:name="heading 2" w:semiHidden="1" w:uiPriority="9" w:unhideWhenUsed="1" w:qFormat="1"/>
@@ -2526,7 +2379,6 @@
     <w:lsdException w:name="HTML Sample" w:semiHidden="1" w:unhideWhenUsed="1"/>
     <w:lsdException w:name="HTML Typewriter" w:semiHidden="1" w:unhideWhenUsed="1"/>
     <w:lsdException w:name="HTML Variable" w:semiHidden="1" w:unhideWhenUsed="1"/>
-    <w:lsdException w:name="Normal Table" w:semiHidden="1" w:unhideWhenUsed="1"/>
     <w:lsdException w:name="annotation subject" w:semiHidden="1" w:unhideWhenUsed="1"/>
     <w:lsdException w:name="No List" w:semiHidden="1" w:unhideWhenUsed="1"/>
     <w:lsdException w:name="Outline List 1" w:semiHidden="1" w:unhideWhenUsed="1"/>
@@ -2570,10 +2422,8 @@
     <w:lsdException w:name="Table Elegant" w:semiHidden="1" w:unhideWhenUsed="1"/>
     <w:lsdException w:name="Table Professional" w:semiHidden="1" w:unhideWhenUsed="1"/>
     <w:lsdException w:name="Table Subtle 1" w:semiHidden="1" w:unhideWhenUsed="1"/>
-    <w:lsdException w:name="Table Subtle 2" w:semiHidden="1" w:unhideWhenUsed="1"/>
     <w:lsdException w:name="Table Web 1" w:semiHidden="1" w:unhideWhenUsed="1"/>
     <w:lsdException w:name="Table Web 2" w:semiHidden="1" w:unhideWhenUsed="1"/>
-    <w:lsdException w:name="Table Web 3" w:semiHidden="1" w:unhideWhenUsed="1"/>
     <w:lsdException w:name="Balloon Text" w:semiHidden="1" w:unhideWhenUsed="1"/>
     <w:lsdException w:name="Table Grid" w:uiPriority="39"/>
     <w:lsdException w:name="Table Theme" w:semiHidden="1" w:unhideWhenUsed="1"/>
@@ -2792,6 +2642,10 @@
     <w:lsdException w:name="List Table 5 Dark Accent 6" w:uiPriority="50"/>
     <w:lsdException w:name="List Table 6 Colorful Accent 6" w:uiPriority="51"/>
     <w:lsdException w:name="List Table 7 Colorful Accent 6" w:uiPriority="52"/>
+    <w:lsdException w:name="Mention" w:semiHidden="1" w:unhideWhenUsed="1"/>
+    <w:lsdException w:name="Smart Hyperlink" w:semiHidden="1" w:unhideWhenUsed="1"/>
+    <w:lsdException w:name="Hashtag" w:semiHidden="1" w:unhideWhenUsed="1"/>
+    <w:lsdException w:name="Unresolved Mention" w:semiHidden="1" w:unhideWhenUsed="1"/>
   </w:latentStyles>
   <w:style w:type="paragraph" w:default="1" w:styleId="Normal">
     <w:name w:val="Normal"/>

</xml_diff>

<commit_message>
Updated the user manual for the setup for the Night of Science 2025.
</commit_message>
<xml_diff>
--- a/User manual for the planetary transit experiment.docx
+++ b/User manual for the planetary transit experiment.docx
@@ -184,9 +184,7 @@
       <w:r>
         <w:t>Access to the computer</w:t>
       </w:r>
-      <w:bookmarkStart w:id="1" w:name="_GoBack"/>
       <w:bookmarkEnd w:id="0"/>
-      <w:bookmarkEnd w:id="1"/>
     </w:p>
     <w:p>
       <w:r>
@@ -297,11 +295,11 @@
       <w:pPr>
         <w:pStyle w:val="Heading1"/>
       </w:pPr>
-      <w:bookmarkStart w:id="2" w:name="_Ref108089892"/>
+      <w:bookmarkStart w:id="1" w:name="_Ref108089892"/>
       <w:r>
         <w:t>The target</w:t>
       </w:r>
-      <w:bookmarkEnd w:id="2"/>
+      <w:bookmarkEnd w:id="1"/>
     </w:p>
     <w:p>
       <w:r>
@@ -314,30 +312,124 @@
         <w:t>ython an</w:t>
       </w:r>
       <w:r>
-        <w:t xml:space="preserve">d shall be invoke with a double </w:t>
-      </w:r>
-      <w:r>
-        <w:t>click on the desktop icon labeled “</w:t>
-      </w:r>
-      <w:r>
-        <w:rPr>
-          <w:b/>
-        </w:rPr>
-        <w:t>Star Generator</w:t>
-      </w:r>
-      <w:r>
-        <w:t xml:space="preserve">” (to access the desktop you can press </w:t>
+        <w:t>d shall be invoke</w:t>
+      </w:r>
+      <w:r>
+        <w:t>d in the terminal:</w:t>
+      </w:r>
+    </w:p>
+    <w:p>
+      <w:pPr>
+        <w:pStyle w:val="ListParagraph"/>
+        <w:numPr>
+          <w:ilvl w:val="0"/>
+          <w:numId w:val="4"/>
+        </w:numPr>
+      </w:pPr>
+      <w:r>
+        <w:t>Start a new power shell (Press windows key and type ‘power shell’, press enter).</w:t>
+      </w:r>
+    </w:p>
+    <w:p>
+      <w:pPr>
+        <w:pStyle w:val="ListParagraph"/>
+        <w:numPr>
+          <w:ilvl w:val="0"/>
+          <w:numId w:val="4"/>
+        </w:numPr>
+      </w:pPr>
+      <w:r>
+        <w:t xml:space="preserve">Navigate to the </w:t>
       </w:r>
       <w:proofErr w:type="spellStart"/>
       <w:r>
-        <w:t>Win+D</w:t>
+        <w:t>transit_cam</w:t>
       </w:r>
       <w:proofErr w:type="spellEnd"/>
       <w:r>
-        <w:t>).</w:t>
-      </w:r>
-      <w:r>
-        <w:t xml:space="preserve"> As usual, before launching a new instance of the program, please make sure that there is no other running in the background. </w:t>
+        <w:t xml:space="preserve"> folder: `cd Documents\</w:t>
+      </w:r>
+      <w:proofErr w:type="spellStart"/>
+      <w:r>
+        <w:t>transit_cam</w:t>
+      </w:r>
+      <w:proofErr w:type="spellEnd"/>
+      <w:r>
+        <w:t>\`</w:t>
+      </w:r>
+    </w:p>
+    <w:p>
+      <w:pPr>
+        <w:pStyle w:val="ListParagraph"/>
+        <w:numPr>
+          <w:ilvl w:val="0"/>
+          <w:numId w:val="4"/>
+        </w:numPr>
+      </w:pPr>
+      <w:r>
+        <w:t>Enable script execution in the power shell session: `</w:t>
+      </w:r>
+      <w:r>
+        <w:t>Set-</w:t>
+      </w:r>
+      <w:proofErr w:type="spellStart"/>
+      <w:r>
+        <w:t>ExecutionPolicy</w:t>
+      </w:r>
+      <w:proofErr w:type="spellEnd"/>
+      <w:r>
+        <w:t xml:space="preserve"> Unrestricted -Scope Process</w:t>
+      </w:r>
+      <w:r>
+        <w:t>`</w:t>
+      </w:r>
+    </w:p>
+    <w:p>
+      <w:pPr>
+        <w:pStyle w:val="ListParagraph"/>
+        <w:numPr>
+          <w:ilvl w:val="0"/>
+          <w:numId w:val="4"/>
+        </w:numPr>
+      </w:pPr>
+      <w:r>
+        <w:t xml:space="preserve">Activate the python virtual environment:  </w:t>
+      </w:r>
+      <w:proofErr w:type="gramStart"/>
+      <w:r>
+        <w:t>`</w:t>
+      </w:r>
+      <w:r>
+        <w:t>.\.</w:t>
+      </w:r>
+      <w:proofErr w:type="spellStart"/>
+      <w:r>
+        <w:t>venv</w:t>
+      </w:r>
+      <w:proofErr w:type="spellEnd"/>
+      <w:r>
+        <w:t>\Scripts\activate</w:t>
+      </w:r>
+      <w:proofErr w:type="gramEnd"/>
+      <w:r>
+        <w:t>`</w:t>
+      </w:r>
+    </w:p>
+    <w:p>
+      <w:pPr>
+        <w:pStyle w:val="ListParagraph"/>
+        <w:numPr>
+          <w:ilvl w:val="0"/>
+          <w:numId w:val="4"/>
+        </w:numPr>
+      </w:pPr>
+      <w:r>
+        <w:t>Start the star generator program: `star-generator.exe`</w:t>
+      </w:r>
+    </w:p>
+    <w:p>
+      <w:r>
+        <w:t xml:space="preserve">As usual, before launching a new instance of the program, please make sure that there is no other running in the background. </w:t>
       </w:r>
     </w:p>
     <w:p>
@@ -345,7 +437,7 @@
         <w:t>The window that pops us shall be dragged to the second monitor located on the other side of the pendulum to act as a target. Maximize the window by double-clicking on the top menu bar.</w:t>
       </w:r>
       <w:r>
-        <w:t xml:space="preserve"> The command line window that also pops-up can be minimized, but it has to stay open because, otherwise, the main display </w:t>
+        <w:t xml:space="preserve"> The command line window can be minimized, but it has to stay open because, otherwise, the main display </w:t>
       </w:r>
       <w:r>
         <w:t xml:space="preserve">will </w:t>
@@ -356,6 +448,7 @@
     </w:p>
     <w:p>
       <w:r>
+        <w:lastRenderedPageBreak/>
         <w:t>The simulated S</w:t>
       </w:r>
       <w:r>
@@ -455,7 +548,6 @@
               <w:jc w:val="right"/>
             </w:pPr>
             <w:r>
-              <w:lastRenderedPageBreak/>
               <w:t>Arrow up:</w:t>
             </w:r>
           </w:p>
@@ -741,13 +833,8 @@
             <w:pPr>
               <w:jc w:val="right"/>
             </w:pPr>
-            <w:proofErr w:type="spellStart"/>
-            <w:r>
-              <w:t>Alt+h</w:t>
-            </w:r>
-            <w:proofErr w:type="spellEnd"/>
-            <w:r>
-              <w:t>:</w:t>
+            <w:r>
+              <w:t>h:</w:t>
             </w:r>
           </w:p>
         </w:tc>
@@ -774,13 +861,8 @@
             <w:pPr>
               <w:jc w:val="right"/>
             </w:pPr>
-            <w:proofErr w:type="spellStart"/>
-            <w:r>
-              <w:t>Alt+k</w:t>
-            </w:r>
-            <w:proofErr w:type="spellEnd"/>
-            <w:r>
-              <w:t>:</w:t>
+            <w:r>
+              <w:t>k:</w:t>
             </w:r>
           </w:p>
         </w:tc>
@@ -807,13 +889,8 @@
             <w:pPr>
               <w:jc w:val="right"/>
             </w:pPr>
-            <w:proofErr w:type="spellStart"/>
-            <w:r>
-              <w:t>Alt+u</w:t>
-            </w:r>
-            <w:proofErr w:type="spellEnd"/>
-            <w:r>
-              <w:t>:</w:t>
+            <w:r>
+              <w:t>u:</w:t>
             </w:r>
           </w:p>
         </w:tc>
@@ -840,13 +917,8 @@
             <w:pPr>
               <w:jc w:val="right"/>
             </w:pPr>
-            <w:proofErr w:type="spellStart"/>
-            <w:r>
-              <w:t>Alk+j</w:t>
-            </w:r>
-            <w:proofErr w:type="spellEnd"/>
-            <w:r>
-              <w:t>:</w:t>
+            <w:r>
+              <w:t>j:</w:t>
             </w:r>
           </w:p>
         </w:tc>
@@ -994,11 +1066,11 @@
       <w:pPr>
         <w:pStyle w:val="Heading1"/>
       </w:pPr>
-      <w:bookmarkStart w:id="3" w:name="_Ref108089934"/>
+      <w:bookmarkStart w:id="2" w:name="_Ref108089934"/>
       <w:r>
         <w:t>The payload</w:t>
       </w:r>
-      <w:bookmarkEnd w:id="3"/>
+      <w:bookmarkEnd w:id="2"/>
     </w:p>
     <w:p>
       <w:r>
@@ -1017,32 +1089,59 @@
         <w:t>ython an</w:t>
       </w:r>
       <w:r>
-        <w:t xml:space="preserve">d shall be invoke with a double </w:t>
-      </w:r>
-      <w:r>
-        <w:t>click on the desktop icon labeled “</w:t>
-      </w:r>
-      <w:r>
+        <w:t>d shall be invoke</w:t>
+      </w:r>
+      <w:r>
+        <w:t>d from the terminal</w:t>
+      </w:r>
+      <w:proofErr w:type="gramStart"/>
+      <w:r>
+        <w:t xml:space="preserve">. </w:t>
+      </w:r>
+      <w:proofErr w:type="gramEnd"/>
+      <w:r>
+        <w:t>Follow the first 4 steps from the previous section to start the power shell and activate the virtual environment</w:t>
+      </w:r>
+      <w:r>
+        <w:t>.</w:t>
+      </w:r>
+      <w:r>
+        <w:t xml:space="preserve"> Then run the program `transit-cam.exe`.</w:t>
+      </w:r>
+      <w:r>
+        <w:t xml:space="preserve"> As usual, before launching a new instance of the program, please make sure that there is no other running in the background.</w:t>
+      </w:r>
+    </w:p>
+    <w:p>
+      <w:pPr>
         <w:rPr>
           <w:b/>
         </w:rPr>
-        <w:t>Transit Cam</w:t>
-      </w:r>
-      <w:r>
-        <w:t xml:space="preserve">” (to access the desktop you can press </w:t>
+      </w:pPr>
+      <w:r>
+        <w:rPr>
+          <w:b/>
+        </w:rPr>
+        <w:t xml:space="preserve">Unfortunately, with the camera we have for the Night of Science 2025, this initialization of the camera with </w:t>
       </w:r>
       <w:proofErr w:type="spellStart"/>
       <w:r>
-        <w:t>Win+D</w:t>
+        <w:rPr>
+          <w:b/>
+        </w:rPr>
+        <w:t>pygames</w:t>
       </w:r>
       <w:proofErr w:type="spellEnd"/>
       <w:r>
-        <w:t>). As usual, before launching a new instance of the program, please make sure that there is no other running in the background.</w:t>
-      </w:r>
-    </w:p>
-    <w:p>
-      <w:r>
-        <w:t xml:space="preserve">The window that pops us shall be kept on one side of the laptop screen to allow the operator to follow the acquisition of the light curves. The command line window that also pops-up can be minimized, but it has to stay open because, otherwise, the main window </w:t>
+        <w:rPr>
+          <w:b/>
+        </w:rPr>
+        <w:t xml:space="preserve"> takes a few minutes! Be patient.</w:t>
+      </w:r>
+    </w:p>
+    <w:p>
+      <w:r>
+        <w:t xml:space="preserve">The window that pops us shall be kept on one side of the laptop screen to allow the operator to follow the acquisition of the light curves. The command line window can be minimized, but it has to stay open because, otherwise, the main window </w:t>
       </w:r>
       <w:r>
         <w:t xml:space="preserve">will close </w:t>
@@ -1106,6 +1205,7 @@
               <w:jc w:val="right"/>
             </w:pPr>
             <w:r>
+              <w:lastRenderedPageBreak/>
               <w:t>Arrow left:</w:t>
             </w:r>
           </w:p>
@@ -1453,7 +1553,6 @@
             </w:pPr>
             <w:proofErr w:type="spellStart"/>
             <w:r>
-              <w:lastRenderedPageBreak/>
               <w:t>Ctrl+</w:t>
             </w:r>
             <w:r>
@@ -1624,154 +1723,101 @@
       <w:pPr>
         <w:pStyle w:val="Heading1"/>
       </w:pPr>
-      <w:bookmarkStart w:id="4" w:name="_Ref108089975"/>
+      <w:bookmarkStart w:id="3" w:name="_Ref108089975"/>
       <w:r>
         <w:t>The light curve analysis</w:t>
       </w:r>
+      <w:bookmarkEnd w:id="3"/>
+    </w:p>
+    <w:p>
+      <w:r>
+        <w:t xml:space="preserve">The third element of the experiment is an analysis tools that processes the recently acquired light curves and plots the results. </w:t>
+      </w:r>
+      <w:r>
+        <w:t xml:space="preserve">Open another power shell and activate the virtual environment as described in section 3. Then run the program `analyze-transit.exe`. </w:t>
+      </w:r>
+      <w:r>
+        <w:t>This command window can stay open and used for every execution of the analysis tool.</w:t>
+      </w:r>
+      <w:r>
+        <w:t xml:space="preserve"> The program will create a PDF for the last light curve data file it finds (the files produced by `transit-cam.exe`). Open the PDF in the browser or a PDF viewer if available.</w:t>
+      </w:r>
+    </w:p>
+    <w:p>
+      <w:r>
+        <w:t xml:space="preserve">The second page in the PDF shows folded light curves. </w:t>
+      </w:r>
+      <w:r>
+        <w:t>The bottom plot represents the “classical” folding of the light curve, where the minima are superimposed, with the ingress on the left side and the egress on the right side. The top panel displays an “accordion” folding of the light curve, which is better suited for this experiment: in this case, the minima are superimposed alternating the direction of the transit, so that half the ingresses will be on the left and half on the right. In this way, all the West flanks will be on the left side (regardless of whether they are ingresses or egresses) and the East flanks on the right. It should be evident that the top plot is more congruent than the bottom one (or at least not worse).</w:t>
+      </w:r>
+      <w:bookmarkStart w:id="4" w:name="_GoBack"/>
       <w:bookmarkEnd w:id="4"/>
     </w:p>
     <w:p>
       <w:r>
-        <w:t xml:space="preserve">The third element of the experiment is an analysis tools that processes the recently acquired light curves and plots the results. Contrary to other elements, this part shall be invoked from the command line. In case there are no command-line windows available, you can create one by pressing </w:t>
+        <w:t>The plots also show the transit period (T) in seconds, the depth of the transits (d) as percentage of relative obscuration and an estimate of the relative radii (r/R) of the transiting planet and the simulated Sun.</w:t>
+      </w:r>
+      <w:r>
+        <w:t xml:space="preserve"> These two plots are automatically saved into a timestamped PDF file (e.g. “</w:t>
+      </w:r>
+      <w:r>
+        <w:t xml:space="preserve">Nacht des </w:t>
       </w:r>
       <w:proofErr w:type="spellStart"/>
       <w:r>
-        <w:t>Win+R</w:t>
+        <w:t>Wissens</w:t>
       </w:r>
       <w:proofErr w:type="spellEnd"/>
       <w:r>
-        <w:t xml:space="preserve"> (a small dialog pops up), typing “</w:t>
+        <w:t xml:space="preserve"> 2022 - 2022_07_07_18_54_08.pdf</w:t>
+      </w:r>
+      <w:r>
+        <w:t>”) that can be printed for the visitors to take home.</w:t>
+      </w:r>
+    </w:p>
+    <w:p>
+      <w:r>
+        <w:t>As explained above, the light curve analysis tool has to be launched manually after each acquisition, but the command-line window can stay open as long as needed.</w:t>
+      </w:r>
+    </w:p>
+    <w:p>
+      <w:pPr>
+        <w:pStyle w:val="Heading1"/>
+      </w:pPr>
+      <w:bookmarkStart w:id="5" w:name="_Ref108090030"/>
+      <w:r>
+        <w:lastRenderedPageBreak/>
+        <w:t>The printing utilities</w:t>
+      </w:r>
+      <w:bookmarkEnd w:id="5"/>
+    </w:p>
+    <w:p>
+      <w:r>
+        <w:t xml:space="preserve">The final element of experiment is simply a standard PDF viewer that will allow us to print the result of the analysis for the visitors to take home. This tool should open automatically by double-clicking on the PDF file to be viewed. Once the plot is displayed, you can print it by pressing </w:t>
       </w:r>
       <w:proofErr w:type="spellStart"/>
       <w:r>
-        <w:t>cmd</w:t>
+        <w:t>Ctrl+P</w:t>
       </w:r>
       <w:proofErr w:type="spellEnd"/>
       <w:r>
-        <w:t xml:space="preserve">” (without the quotes) and pressing Enter. </w:t>
-      </w:r>
-      <w:r>
-        <w:t>To go to the right folder simply type “</w:t>
-      </w:r>
-      <w:r>
-        <w:rPr>
-          <w:b/>
-        </w:rPr>
-        <w:t>cd \Users\</w:t>
-      </w:r>
-      <w:proofErr w:type="spellStart"/>
-      <w:r>
-        <w:rPr>
-          <w:b/>
-        </w:rPr>
-        <w:t>vicouser</w:t>
-      </w:r>
-      <w:proofErr w:type="spellEnd"/>
-      <w:r>
-        <w:rPr>
-          <w:b/>
-        </w:rPr>
-        <w:t>\Documents\python\</w:t>
-      </w:r>
-      <w:proofErr w:type="spellStart"/>
-      <w:r>
-        <w:rPr>
-          <w:b/>
-        </w:rPr>
-        <w:t>transit_cam</w:t>
-      </w:r>
-      <w:proofErr w:type="spellEnd"/>
-      <w:r>
-        <w:t>”. This command window can stay open and used for every execution of the analysis tool.</w:t>
-      </w:r>
-    </w:p>
-    <w:p>
-      <w:r>
-        <w:t>To perform the analysis of the last light curve simply type “</w:t>
-      </w:r>
-      <w:r>
-        <w:rPr>
-          <w:b/>
-        </w:rPr>
-        <w:t>python analyze_transit.py</w:t>
-      </w:r>
-      <w:r>
-        <w:t>” and press Enter. In all likelihood, you will be able to save the typing by pressing the arrow up to repeat the previous command. Upon execution, the application will first show the whole light curve as relative brightness over time. If the analysis tool manages to find the minima of the curve, they will be marked in red.</w:t>
-      </w:r>
-    </w:p>
-    <w:p>
-      <w:r>
-        <w:t xml:space="preserve">Close the first window by clicking on the ‘X’ at the top right corner and the application will display a two-plot </w:t>
-      </w:r>
-      <w:r>
-        <w:t>graph of the folded light curve. The bottom plot represents the “classical” folding of the light curve, where the minima are superimposed, with the ingress on the left side and the egress on the right side. The top panel displays an “accordion” folding of the light curve, which is better suited for this experiment: in this case, the minima are superimposed alternating the direction of the transit, so that half the ingresses will be on the left and half on the right. In this way, all the West flanks will be on the left side (regardless of whether they are ingresses or egresses) and the East flanks on the right. It should be evident that the top plot is more congruent than the bottom one (or at least not worse).</w:t>
-      </w:r>
-    </w:p>
-    <w:p>
-      <w:r>
-        <w:t>The plots also show the transit period (T) in seconds, the depth of the transits (d) as percentage of relative obscuration and an estimate of the relative radii (r/R) of the transiting planet and the simulated Sun.</w:t>
-      </w:r>
-      <w:r>
-        <w:t xml:space="preserve"> These two plots are automatically saved into a timestamped PDF file (e.g. “</w:t>
-      </w:r>
-      <w:r>
-        <w:t xml:space="preserve">Nacht des </w:t>
-      </w:r>
-      <w:proofErr w:type="spellStart"/>
-      <w:r>
-        <w:t>Wissens</w:t>
-      </w:r>
-      <w:proofErr w:type="spellEnd"/>
-      <w:r>
-        <w:t xml:space="preserve"> 2022 - 2022_07_07_18_54_08.pdf</w:t>
-      </w:r>
-      <w:r>
-        <w:t>”) that can be printed for the visitors to take home.</w:t>
-      </w:r>
-    </w:p>
-    <w:p>
-      <w:r>
-        <w:t>As explained above, the light curve analysis tool has to be launched manually after each acquisition, but the command-line window can stay open as long as needed.</w:t>
+        <w:t xml:space="preserve"> and then Enter</w:t>
+      </w:r>
+      <w:r>
+        <w:t>.</w:t>
+      </w:r>
+    </w:p>
+    <w:p>
+      <w:r>
+        <w:t>The viewer can be kept open as long as necessary and the new files will automatically be shown as they are opened.</w:t>
       </w:r>
     </w:p>
     <w:p>
       <w:pPr>
         <w:pStyle w:val="Heading1"/>
       </w:pPr>
-      <w:bookmarkStart w:id="5" w:name="_Ref108090030"/>
-      <w:r>
-        <w:t>The printing utilities</w:t>
-      </w:r>
-      <w:bookmarkEnd w:id="5"/>
-    </w:p>
-    <w:p>
-      <w:r>
-        <w:t xml:space="preserve">The final element of experiment is simply a standard PDF viewer that will allow us to print the result of the analysis for the visitors to take home. This tool should open automatically by double-clicking on the PDF file to be viewed. Once the plot is displayed, you can print it by pressing </w:t>
-      </w:r>
-      <w:proofErr w:type="spellStart"/>
-      <w:r>
-        <w:t>Ctrl+P</w:t>
-      </w:r>
-      <w:proofErr w:type="spellEnd"/>
-      <w:r>
-        <w:t xml:space="preserve"> and then Enter</w:t>
-      </w:r>
-      <w:r>
-        <w:t>.</w:t>
-      </w:r>
-    </w:p>
-    <w:p>
-      <w:r>
-        <w:t>The viewer can be kept open as long as necessary and the new files will automatically be shown as they are opened.</w:t>
-      </w:r>
-    </w:p>
-    <w:p>
-      <w:pPr>
-        <w:pStyle w:val="Heading1"/>
-      </w:pPr>
       <w:bookmarkStart w:id="6" w:name="_Ref108111288"/>
       <w:r>
-        <w:lastRenderedPageBreak/>
         <w:t>Execution of the experiment</w:t>
       </w:r>
       <w:bookmarkEnd w:id="6"/>
@@ -2244,6 +2290,92 @@
       </w:pPr>
     </w:lvl>
   </w:abstractNum>
+  <w:abstractNum w:abstractNumId="3" w15:restartNumberingAfterBreak="0">
+    <w:nsid w:val="6390695A"/>
+    <w:multiLevelType w:val="hybridMultilevel"/>
+    <w:tmpl w:val="BBA65E14"/>
+    <w:lvl w:ilvl="0" w:tplc="0409000F">
+      <w:start w:val="1"/>
+      <w:numFmt w:val="decimal"/>
+      <w:lvlText w:val="%1."/>
+      <w:lvlJc w:val="left"/>
+      <w:pPr>
+        <w:ind w:left="720" w:hanging="360"/>
+      </w:pPr>
+    </w:lvl>
+    <w:lvl w:ilvl="1" w:tplc="04090019" w:tentative="1">
+      <w:start w:val="1"/>
+      <w:numFmt w:val="lowerLetter"/>
+      <w:lvlText w:val="%2."/>
+      <w:lvlJc w:val="left"/>
+      <w:pPr>
+        <w:ind w:left="1440" w:hanging="360"/>
+      </w:pPr>
+    </w:lvl>
+    <w:lvl w:ilvl="2" w:tplc="0409001B" w:tentative="1">
+      <w:start w:val="1"/>
+      <w:numFmt w:val="lowerRoman"/>
+      <w:lvlText w:val="%3."/>
+      <w:lvlJc w:val="right"/>
+      <w:pPr>
+        <w:ind w:left="2160" w:hanging="180"/>
+      </w:pPr>
+    </w:lvl>
+    <w:lvl w:ilvl="3" w:tplc="0409000F" w:tentative="1">
+      <w:start w:val="1"/>
+      <w:numFmt w:val="decimal"/>
+      <w:lvlText w:val="%4."/>
+      <w:lvlJc w:val="left"/>
+      <w:pPr>
+        <w:ind w:left="2880" w:hanging="360"/>
+      </w:pPr>
+    </w:lvl>
+    <w:lvl w:ilvl="4" w:tplc="04090019" w:tentative="1">
+      <w:start w:val="1"/>
+      <w:numFmt w:val="lowerLetter"/>
+      <w:lvlText w:val="%5."/>
+      <w:lvlJc w:val="left"/>
+      <w:pPr>
+        <w:ind w:left="3600" w:hanging="360"/>
+      </w:pPr>
+    </w:lvl>
+    <w:lvl w:ilvl="5" w:tplc="0409001B" w:tentative="1">
+      <w:start w:val="1"/>
+      <w:numFmt w:val="lowerRoman"/>
+      <w:lvlText w:val="%6."/>
+      <w:lvlJc w:val="right"/>
+      <w:pPr>
+        <w:ind w:left="4320" w:hanging="180"/>
+      </w:pPr>
+    </w:lvl>
+    <w:lvl w:ilvl="6" w:tplc="0409000F" w:tentative="1">
+      <w:start w:val="1"/>
+      <w:numFmt w:val="decimal"/>
+      <w:lvlText w:val="%7."/>
+      <w:lvlJc w:val="left"/>
+      <w:pPr>
+        <w:ind w:left="5040" w:hanging="360"/>
+      </w:pPr>
+    </w:lvl>
+    <w:lvl w:ilvl="7" w:tplc="04090019" w:tentative="1">
+      <w:start w:val="1"/>
+      <w:numFmt w:val="lowerLetter"/>
+      <w:lvlText w:val="%8."/>
+      <w:lvlJc w:val="left"/>
+      <w:pPr>
+        <w:ind w:left="5760" w:hanging="360"/>
+      </w:pPr>
+    </w:lvl>
+    <w:lvl w:ilvl="8" w:tplc="0409001B" w:tentative="1">
+      <w:start w:val="1"/>
+      <w:numFmt w:val="lowerRoman"/>
+      <w:lvlText w:val="%9."/>
+      <w:lvlJc w:val="right"/>
+      <w:pPr>
+        <w:ind w:left="6480" w:hanging="180"/>
+      </w:pPr>
+    </w:lvl>
+  </w:abstractNum>
   <w:num w:numId="1">
     <w:abstractNumId w:val="0"/>
   </w:num>
@@ -2252,6 +2384,9 @@
   </w:num>
   <w:num w:numId="3">
     <w:abstractNumId w:val="1"/>
+  </w:num>
+  <w:num w:numId="4">
+    <w:abstractNumId w:val="3"/>
   </w:num>
 </w:numbering>
 </file>
@@ -2379,6 +2514,7 @@
     <w:lsdException w:name="HTML Sample" w:semiHidden="1" w:unhideWhenUsed="1"/>
     <w:lsdException w:name="HTML Typewriter" w:semiHidden="1" w:unhideWhenUsed="1"/>
     <w:lsdException w:name="HTML Variable" w:semiHidden="1" w:unhideWhenUsed="1"/>
+    <w:lsdException w:name="Normal Table" w:semiHidden="1" w:unhideWhenUsed="1"/>
     <w:lsdException w:name="annotation subject" w:semiHidden="1" w:unhideWhenUsed="1"/>
     <w:lsdException w:name="No List" w:semiHidden="1" w:unhideWhenUsed="1"/>
     <w:lsdException w:name="Outline List 1" w:semiHidden="1" w:unhideWhenUsed="1"/>
@@ -2422,8 +2558,10 @@
     <w:lsdException w:name="Table Elegant" w:semiHidden="1" w:unhideWhenUsed="1"/>
     <w:lsdException w:name="Table Professional" w:semiHidden="1" w:unhideWhenUsed="1"/>
     <w:lsdException w:name="Table Subtle 1" w:semiHidden="1" w:unhideWhenUsed="1"/>
+    <w:lsdException w:name="Table Subtle 2" w:semiHidden="1" w:unhideWhenUsed="1"/>
     <w:lsdException w:name="Table Web 1" w:semiHidden="1" w:unhideWhenUsed="1"/>
     <w:lsdException w:name="Table Web 2" w:semiHidden="1" w:unhideWhenUsed="1"/>
+    <w:lsdException w:name="Table Web 3" w:semiHidden="1" w:unhideWhenUsed="1"/>
     <w:lsdException w:name="Balloon Text" w:semiHidden="1" w:unhideWhenUsed="1"/>
     <w:lsdException w:name="Table Grid" w:uiPriority="39"/>
     <w:lsdException w:name="Table Theme" w:semiHidden="1" w:unhideWhenUsed="1"/>

</xml_diff>

<commit_message>
Updated the user manual.
</commit_message>
<xml_diff>
--- a/User manual for the planetary transit experiment.docx
+++ b/User manual for the planetary transit experiment.docx
@@ -1092,15 +1092,7 @@
         <w:t>d shall be invoke</w:t>
       </w:r>
       <w:r>
-        <w:t>d from the terminal</w:t>
-      </w:r>
-      <w:proofErr w:type="gramStart"/>
-      <w:r>
-        <w:t xml:space="preserve">. </w:t>
-      </w:r>
-      <w:proofErr w:type="gramEnd"/>
-      <w:r>
-        <w:t>Follow the first 4 steps from the previous section to start the power shell and activate the virtual environment</w:t>
+        <w:t>d from the terminal. Follow the first 4 steps from the previous section to start the power shell and activate the virtual environment</w:t>
       </w:r>
       <w:r>
         <w:t>.</w:t>
@@ -1750,8 +1742,6 @@
       <w:r>
         <w:t>The bottom plot represents the “classical” folding of the light curve, where the minima are superimposed, with the ingress on the left side and the egress on the right side. The top panel displays an “accordion” folding of the light curve, which is better suited for this experiment: in this case, the minima are superimposed alternating the direction of the transit, so that half the ingresses will be on the left and half on the right. In this way, all the West flanks will be on the left side (regardless of whether they are ingresses or egresses) and the East flanks on the right. It should be evident that the top plot is more congruent than the bottom one (or at least not worse).</w:t>
       </w:r>
-      <w:bookmarkStart w:id="4" w:name="_GoBack"/>
-      <w:bookmarkEnd w:id="4"/>
     </w:p>
     <w:p>
       <w:r>
@@ -1784,43 +1774,43 @@
       <w:pPr>
         <w:pStyle w:val="Heading1"/>
       </w:pPr>
-      <w:bookmarkStart w:id="5" w:name="_Ref108090030"/>
+      <w:bookmarkStart w:id="4" w:name="_Ref108090030"/>
       <w:r>
         <w:lastRenderedPageBreak/>
         <w:t>The printing utilities</w:t>
       </w:r>
+      <w:bookmarkEnd w:id="4"/>
+    </w:p>
+    <w:p>
+      <w:r>
+        <w:t xml:space="preserve">The final element of experiment is simply a standard PDF viewer that will allow us to print the result of the analysis for the visitors to take home. This tool should open automatically by double-clicking on the PDF file to be viewed. Once the plot is displayed, you can print it by pressing </w:t>
+      </w:r>
+      <w:proofErr w:type="spellStart"/>
+      <w:r>
+        <w:t>Ctrl+P</w:t>
+      </w:r>
+      <w:proofErr w:type="spellEnd"/>
+      <w:r>
+        <w:t xml:space="preserve"> and then Enter</w:t>
+      </w:r>
+      <w:r>
+        <w:t>.</w:t>
+      </w:r>
+    </w:p>
+    <w:p>
+      <w:r>
+        <w:t>The viewer can be kept open as long as necessary and the new files will automatically be shown as they are opened.</w:t>
+      </w:r>
+    </w:p>
+    <w:p>
+      <w:pPr>
+        <w:pStyle w:val="Heading1"/>
+      </w:pPr>
+      <w:bookmarkStart w:id="5" w:name="_Ref108111288"/>
+      <w:r>
+        <w:t>Execution of the experiment</w:t>
+      </w:r>
       <w:bookmarkEnd w:id="5"/>
-    </w:p>
-    <w:p>
-      <w:r>
-        <w:t xml:space="preserve">The final element of experiment is simply a standard PDF viewer that will allow us to print the result of the analysis for the visitors to take home. This tool should open automatically by double-clicking on the PDF file to be viewed. Once the plot is displayed, you can print it by pressing </w:t>
-      </w:r>
-      <w:proofErr w:type="spellStart"/>
-      <w:r>
-        <w:t>Ctrl+P</w:t>
-      </w:r>
-      <w:proofErr w:type="spellEnd"/>
-      <w:r>
-        <w:t xml:space="preserve"> and then Enter</w:t>
-      </w:r>
-      <w:r>
-        <w:t>.</w:t>
-      </w:r>
-    </w:p>
-    <w:p>
-      <w:r>
-        <w:t>The viewer can be kept open as long as necessary and the new files will automatically be shown as they are opened.</w:t>
-      </w:r>
-    </w:p>
-    <w:p>
-      <w:pPr>
-        <w:pStyle w:val="Heading1"/>
-      </w:pPr>
-      <w:bookmarkStart w:id="6" w:name="_Ref108111288"/>
-      <w:r>
-        <w:t>Execution of the experiment</w:t>
-      </w:r>
-      <w:bookmarkEnd w:id="6"/>
     </w:p>
     <w:p>
       <w:r>
@@ -1974,7 +1964,31 @@
         </w:numPr>
       </w:pPr>
       <w:r>
-        <w:t>Invoke the analysis tool by typing “python analyze_transit.py” in a suitable command-line window. You can then explain the plots to the visitor. The title of the plot can be personalized by typing instead “python analyze_transit.py –n ‘my name’” (use quotes around the name if you use more than one word).</w:t>
+        <w:t>Invoke the analysis tool by typing “</w:t>
+      </w:r>
+      <w:r>
+        <w:t>analyze-transit.exe</w:t>
+      </w:r>
+      <w:r>
+        <w:t xml:space="preserve">” in a suitable command-line window. You can then explain the plots to the visitor. The title of the plot can be personalized by typing instead “python </w:t>
+      </w:r>
+      <w:r>
+        <w:t>analyze-transit.exe</w:t>
+      </w:r>
+      <w:r>
+        <w:t xml:space="preserve"> </w:t>
+      </w:r>
+      <w:r>
+        <w:t>–planet-name</w:t>
+      </w:r>
+      <w:r>
+        <w:t xml:space="preserve"> </w:t>
+      </w:r>
+      <w:r>
+        <w:t>‘</w:t>
+      </w:r>
+      <w:r>
+        <w:t>my name’” (use quotes around the name if you use more than one word).</w:t>
       </w:r>
     </w:p>
     <w:p>
@@ -1991,6 +2005,8 @@
       <w:r>
         <w:t>analysis application ends, you can double-click on the last PDF and print it for the visitor.</w:t>
       </w:r>
+      <w:bookmarkStart w:id="6" w:name="_GoBack"/>
+      <w:bookmarkEnd w:id="6"/>
     </w:p>
     <w:sectPr>
       <w:pgSz w:w="11906" w:h="16838"/>
@@ -2000,6 +2016,56 @@
     </w:sectPr>
   </w:body>
 </w:document>
+</file>
+
+<file path=word/endnotes.xml><?xml version="1.0" encoding="utf-8"?>
+<w:endnotes xmlns:wpc="http://schemas.microsoft.com/office/word/2010/wordprocessingCanvas" xmlns:cx="http://schemas.microsoft.com/office/drawing/2014/chartex" xmlns:cx1="http://schemas.microsoft.com/office/drawing/2015/9/8/chartex" xmlns:cx2="http://schemas.microsoft.com/office/drawing/2015/10/21/chartex" xmlns:cx3="http://schemas.microsoft.com/office/drawing/2016/5/9/chartex" xmlns:cx4="http://schemas.microsoft.com/office/drawing/2016/5/10/chartex" xmlns:cx5="http://schemas.microsoft.com/office/drawing/2016/5/11/chartex" xmlns:cx6="http://schemas.microsoft.com/office/drawing/2016/5/12/chartex" xmlns:cx7="http://schemas.microsoft.com/office/drawing/2016/5/13/chartex" xmlns:cx8="http://schemas.microsoft.com/office/drawing/2016/5/14/chartex" xmlns:mc="http://schemas.openxmlformats.org/markup-compatibility/2006" xmlns:aink="http://schemas.microsoft.com/office/drawing/2016/ink" xmlns:am3d="http://schemas.microsoft.com/office/drawing/2017/model3d" xmlns:o="urn:schemas-microsoft-com:office:office" xmlns:r="http://schemas.openxmlformats.org/officeDocument/2006/relationships" xmlns:m="http://schemas.openxmlformats.org/officeDocument/2006/math" xmlns:v="urn:schemas-microsoft-com:vml" xmlns:wp14="http://schemas.microsoft.com/office/word/2010/wordprocessingDrawing" xmlns:wp="http://schemas.openxmlformats.org/drawingml/2006/wordprocessingDrawing" xmlns:w10="urn:schemas-microsoft-com:office:word" xmlns:w="http://schemas.openxmlformats.org/wordprocessingml/2006/main" xmlns:w14="http://schemas.microsoft.com/office/word/2010/wordml" xmlns:w15="http://schemas.microsoft.com/office/word/2012/wordml" xmlns:w16cid="http://schemas.microsoft.com/office/word/2016/wordml/cid" xmlns:w16se="http://schemas.microsoft.com/office/word/2015/wordml/symex" xmlns:wpg="http://schemas.microsoft.com/office/word/2010/wordprocessingGroup" xmlns:wpi="http://schemas.microsoft.com/office/word/2010/wordprocessingInk" xmlns:wne="http://schemas.microsoft.com/office/word/2006/wordml" xmlns:wps="http://schemas.microsoft.com/office/word/2010/wordprocessingShape" mc:Ignorable="w14 w15 w16se w16cid wp14">
+  <w:endnote w:type="separator" w:id="-1">
+    <w:p>
+      <w:pPr>
+        <w:spacing w:after="0" w:line="240" w:lineRule="auto"/>
+      </w:pPr>
+      <w:r>
+        <w:separator/>
+      </w:r>
+    </w:p>
+  </w:endnote>
+  <w:endnote w:type="continuationSeparator" w:id="0">
+    <w:p>
+      <w:pPr>
+        <w:spacing w:after="0" w:line="240" w:lineRule="auto"/>
+      </w:pPr>
+      <w:r>
+        <w:continuationSeparator/>
+      </w:r>
+    </w:p>
+  </w:endnote>
+</w:endnotes>
+</file>
+
+<file path=word/footnotes.xml><?xml version="1.0" encoding="utf-8"?>
+<w:footnotes xmlns:wpc="http://schemas.microsoft.com/office/word/2010/wordprocessingCanvas" xmlns:cx="http://schemas.microsoft.com/office/drawing/2014/chartex" xmlns:cx1="http://schemas.microsoft.com/office/drawing/2015/9/8/chartex" xmlns:cx2="http://schemas.microsoft.com/office/drawing/2015/10/21/chartex" xmlns:cx3="http://schemas.microsoft.com/office/drawing/2016/5/9/chartex" xmlns:cx4="http://schemas.microsoft.com/office/drawing/2016/5/10/chartex" xmlns:cx5="http://schemas.microsoft.com/office/drawing/2016/5/11/chartex" xmlns:cx6="http://schemas.microsoft.com/office/drawing/2016/5/12/chartex" xmlns:cx7="http://schemas.microsoft.com/office/drawing/2016/5/13/chartex" xmlns:cx8="http://schemas.microsoft.com/office/drawing/2016/5/14/chartex" xmlns:mc="http://schemas.openxmlformats.org/markup-compatibility/2006" xmlns:aink="http://schemas.microsoft.com/office/drawing/2016/ink" xmlns:am3d="http://schemas.microsoft.com/office/drawing/2017/model3d" xmlns:o="urn:schemas-microsoft-com:office:office" xmlns:r="http://schemas.openxmlformats.org/officeDocument/2006/relationships" xmlns:m="http://schemas.openxmlformats.org/officeDocument/2006/math" xmlns:v="urn:schemas-microsoft-com:vml" xmlns:wp14="http://schemas.microsoft.com/office/word/2010/wordprocessingDrawing" xmlns:wp="http://schemas.openxmlformats.org/drawingml/2006/wordprocessingDrawing" xmlns:w10="urn:schemas-microsoft-com:office:word" xmlns:w="http://schemas.openxmlformats.org/wordprocessingml/2006/main" xmlns:w14="http://schemas.microsoft.com/office/word/2010/wordml" xmlns:w15="http://schemas.microsoft.com/office/word/2012/wordml" xmlns:w16cid="http://schemas.microsoft.com/office/word/2016/wordml/cid" xmlns:w16se="http://schemas.microsoft.com/office/word/2015/wordml/symex" xmlns:wpg="http://schemas.microsoft.com/office/word/2010/wordprocessingGroup" xmlns:wpi="http://schemas.microsoft.com/office/word/2010/wordprocessingInk" xmlns:wne="http://schemas.microsoft.com/office/word/2006/wordml" xmlns:wps="http://schemas.microsoft.com/office/word/2010/wordprocessingShape" mc:Ignorable="w14 w15 w16se w16cid wp14">
+  <w:footnote w:type="separator" w:id="-1">
+    <w:p>
+      <w:pPr>
+        <w:spacing w:after="0" w:line="240" w:lineRule="auto"/>
+      </w:pPr>
+      <w:r>
+        <w:separator/>
+      </w:r>
+    </w:p>
+  </w:footnote>
+  <w:footnote w:type="continuationSeparator" w:id="0">
+    <w:p>
+      <w:pPr>
+        <w:spacing w:after="0" w:line="240" w:lineRule="auto"/>
+      </w:pPr>
+      <w:r>
+        <w:continuationSeparator/>
+      </w:r>
+    </w:p>
+  </w:footnote>
+</w:footnotes>
 </file>
 
 <file path=word/numbering.xml><?xml version="1.0" encoding="utf-8"?>
@@ -2923,6 +2989,50 @@
       <w:contextualSpacing/>
     </w:pPr>
   </w:style>
+  <w:style w:type="paragraph" w:styleId="Header">
+    <w:name w:val="header"/>
+    <w:basedOn w:val="Normal"/>
+    <w:link w:val="HeaderChar"/>
+    <w:uiPriority w:val="99"/>
+    <w:unhideWhenUsed/>
+    <w:rsid w:val="0002031F"/>
+    <w:pPr>
+      <w:tabs>
+        <w:tab w:val="center" w:pos="4680"/>
+        <w:tab w:val="right" w:pos="9360"/>
+      </w:tabs>
+      <w:spacing w:after="0" w:line="240" w:lineRule="auto"/>
+    </w:pPr>
+  </w:style>
+  <w:style w:type="character" w:customStyle="1" w:styleId="HeaderChar">
+    <w:name w:val="Header Char"/>
+    <w:basedOn w:val="DefaultParagraphFont"/>
+    <w:link w:val="Header"/>
+    <w:uiPriority w:val="99"/>
+    <w:rsid w:val="0002031F"/>
+  </w:style>
+  <w:style w:type="paragraph" w:styleId="Footer">
+    <w:name w:val="footer"/>
+    <w:basedOn w:val="Normal"/>
+    <w:link w:val="FooterChar"/>
+    <w:uiPriority w:val="99"/>
+    <w:unhideWhenUsed/>
+    <w:rsid w:val="0002031F"/>
+    <w:pPr>
+      <w:tabs>
+        <w:tab w:val="center" w:pos="4680"/>
+        <w:tab w:val="right" w:pos="9360"/>
+      </w:tabs>
+      <w:spacing w:after="0" w:line="240" w:lineRule="auto"/>
+    </w:pPr>
+  </w:style>
+  <w:style w:type="character" w:customStyle="1" w:styleId="FooterChar">
+    <w:name w:val="Footer Char"/>
+    <w:basedOn w:val="DefaultParagraphFont"/>
+    <w:link w:val="Footer"/>
+    <w:uiPriority w:val="99"/>
+    <w:rsid w:val="0002031F"/>
+  </w:style>
 </w:styles>
 </file>
 

</xml_diff>